<commit_message>
feat(pm-portal): add shipping documents, workflow automation, and project handover tools
- Add shipping documents controller, models, services, and Excel templates (invoice & packing)
- Implement workflow center, Outlook background synchronization, and task queue
- Enhance receivables tracking, bilateral y-axis comparison, and contract milestone editor
- Add project handover, mail audit, and payment schedule reconciliation scripts
- Include approved weekly report PPTX templates and tiep nhan du an reports
- Update email center templates and DFV repair processing tools
- Establish failure lessons learned handbook and secure local credentials
</commit_message>
<xml_diff>
--- a/Ho So Du An/Nghiem Thu/Bien_Ban_Nghiem_Thu_Lap_Dat_HMV151020250001.docx
+++ b/Ho So Du An/Nghiem Thu/Bien_Ban_Nghiem_Thu_Lap_Dat_HMV151020250001.docx
@@ -468,9 +468,6 @@
           <w:p>
             <w:pPr>
               <w:spacing w:line="240" w:lineRule="auto"/>
-              <w:rPr>
-                <w:lang w:val="vi-VN"/>
-              </w:rPr>
             </w:pPr>
             <w:r>
               <w:rPr>
@@ -2677,7 +2674,7 @@
         <w:spacing w:before="40" w:after="60" w:line="240" w:lineRule="auto"/>
         <w:jc w:val="center"/>
         <w:rPr>
-          <w:lang w:val="vi-VN" w:eastAsia="zh-TW"/>
+          <w:lang w:eastAsia="zh-TW"/>
         </w:rPr>
       </w:pPr>
       <w:r>
@@ -2685,7 +2682,7 @@
           <w:b/>
           <w:color w:val="1F4E79"/>
           <w:sz w:val="26"/>
-          <w:lang w:val="vi-VN" w:eastAsia="zh-TW"/>
+          <w:lang w:eastAsia="zh-TW"/>
         </w:rPr>
         <w:t xml:space="preserve">CHỮ KÝ XÁC NHẬN / </w:t>
       </w:r>
@@ -2694,7 +2691,7 @@
           <w:b/>
           <w:color w:val="1F4E79"/>
           <w:sz w:val="26"/>
-          <w:lang w:val="vi-VN" w:eastAsia="zh-TW"/>
+          <w:lang w:eastAsia="zh-TW"/>
         </w:rPr>
         <w:t>簽署確認</w:t>
       </w:r>
@@ -2757,10 +2754,6 @@
           <w:p>
             <w:pPr>
               <w:jc w:val="center"/>
-              <w:rPr>
-                <w:b/>
-                <w:sz w:val="19"/>
-              </w:rPr>
             </w:pPr>
             <w:r/>
             <w:r>
@@ -2963,8 +2956,13 @@
     </w:tbl>
     <w:p>
       <w:pPr>
-        <w:spacing w:after="20" w:line="259" w:lineRule="auto"/>
+        <w:spacing w:before="100" w:line="240" w:lineRule="auto"/>
         <w:jc w:val="center"/>
+        <w:rPr>
+          <w:color w:val="808080"/>
+          <w:sz w:val="16"/>
+          <w:lang w:val="vi-VN"/>
+        </w:rPr>
       </w:pPr>
       <w:r/>
       <w:r>
@@ -2985,6 +2983,12 @@
         </w:rPr>
         <w:t>Bên dưới là hình ảnh trong RFID 硬體 (RFID Hardware) – Phần mềm tùy chỉnh chức năng hệ thống RFID.下面是 RFID 硬體（RFID Hardware）－ RFID 系統客製化軟體 中的畫面。</w:t>
       </w:r>
+    </w:p>
+    <w:p>
+      <w:pPr>
+        <w:spacing w:before="100" w:line="240" w:lineRule="auto"/>
+        <w:jc w:val="center"/>
+      </w:pPr>
     </w:p>
     <w:sectPr>
       <w:footerReference w:type="default" r:id="rId8"/>
@@ -3227,22 +3231,22 @@
       </w:rPr>
     </w:lvl>
   </w:abstractNum>
-  <w:num w:numId="1" w16cid:durableId="2046323626">
+  <w:num w:numId="1" w16cid:durableId="1062169915">
     <w:abstractNumId w:val="5"/>
   </w:num>
-  <w:num w:numId="2" w16cid:durableId="990674181">
+  <w:num w:numId="2" w16cid:durableId="1444114337">
     <w:abstractNumId w:val="3"/>
   </w:num>
-  <w:num w:numId="3" w16cid:durableId="549927082">
+  <w:num w:numId="3" w16cid:durableId="820345529">
     <w:abstractNumId w:val="2"/>
   </w:num>
-  <w:num w:numId="4" w16cid:durableId="1375884428">
+  <w:num w:numId="4" w16cid:durableId="546383212">
     <w:abstractNumId w:val="4"/>
   </w:num>
-  <w:num w:numId="5" w16cid:durableId="559361713">
+  <w:num w:numId="5" w16cid:durableId="478616271">
     <w:abstractNumId w:val="1"/>
   </w:num>
-  <w:num w:numId="6" w16cid:durableId="1105811418">
+  <w:num w:numId="6" w16cid:durableId="1910191019">
     <w:abstractNumId w:val="0"/>
   </w:num>
 </w:numbering>
@@ -3640,7 +3644,6 @@
   <w:style w:type="paragraph" w:default="1" w:styleId="Normal">
     <w:name w:val="Normal"/>
     <w:qFormat/>
-    <w:rsid w:val="006717F4"/>
     <w:pPr>
       <w:spacing w:line="252" w:lineRule="auto"/>
     </w:pPr>
@@ -3854,6 +3857,7 @@
   <w:style w:type="character" w:default="1" w:styleId="DefaultParagraphFont">
     <w:name w:val="Default Paragraph Font"/>
     <w:uiPriority w:val="1"/>
+    <w:semiHidden/>
     <w:unhideWhenUsed/>
   </w:style>
   <w:style w:type="table" w:default="1" w:styleId="TableNormal">

</xml_diff>